<commit_message>
Tighten published framework figure crops
</commit_message>
<xml_diff>
--- a/current-study/outputs/Evidence_Pack_Author_Constructed_Framework_and_Questionnaire.docx
+++ b/current-study/outputs/Evidence_Pack_Author_Constructed_Framework_and_Questionnaire.docx
@@ -280,7 +280,7 @@
       <w:r>
         <w:drawing>
           <wp:inline xmlns:a="http://schemas.openxmlformats.org/drawingml/2006/main" xmlns:pic="http://schemas.openxmlformats.org/drawingml/2006/picture">
-            <wp:extent cx="5349240" cy="3282488"/>
+            <wp:extent cx="5349240" cy="2996790"/>
             <wp:docPr id="2" name="Picture 2" title="Conceptual framework" descr="Published micro-credential framework combining technology acceptance and self-determination variables to explain attitude and behavioural intention."/>
             <wp:cNvGraphicFramePr>
               <a:graphicFrameLocks noChangeAspect="1"/>
@@ -301,7 +301,7 @@
                   <pic:spPr>
                     <a:xfrm>
                       <a:off x="0" y="0"/>
-                      <a:ext cx="5349240" cy="3282488"/>
+                      <a:ext cx="5349240" cy="2996790"/>
                     </a:xfrm>
                     <a:prstGeom prst="rect"/>
                   </pic:spPr>
@@ -352,7 +352,7 @@
       <w:r>
         <w:drawing>
           <wp:inline xmlns:a="http://schemas.openxmlformats.org/drawingml/2006/main" xmlns:pic="http://schemas.openxmlformats.org/drawingml/2006/picture">
-            <wp:extent cx="4800600" cy="4957629"/>
+            <wp:extent cx="4114800" cy="4076344"/>
             <wp:docPr id="3" name="Picture 3" title="Conceptual framework" descr="Published Steenkamp digital-badge framework containing eleven constructs and thirteen directional relationships."/>
             <wp:cNvGraphicFramePr>
               <a:graphicFrameLocks noChangeAspect="1"/>
@@ -373,7 +373,7 @@
                   <pic:spPr>
                     <a:xfrm>
                       <a:off x="0" y="0"/>
-                      <a:ext cx="4800600" cy="4957629"/>
+                      <a:ext cx="4114800" cy="4076344"/>
                     </a:xfrm>
                     <a:prstGeom prst="rect"/>
                   </pic:spPr>

</xml_diff>